<commit_message>
docs: add authentication theme toggle section to relationships and lineage guide
</commit_message>
<xml_diff>
--- a/docs/FAMILY_RELATIONSHIPS_AND_LINEAGE_GUIDE.docx
+++ b/docs/FAMILY_RELATIONSHIPS_AND_LINEAGE_GUIDE.docx
@@ -2959,6 +2959,23 @@
       </w:pPr>
       <w:r>
         <w:t xml:space="preserve">When geo-location is introduced via the IP lookup endpoint (e.g. https://api.ip2location.io/?key={YOUR_API_KEY}&amp;ip={IP}), the client will detect country code "BD" and dynamically activate Bengali translation tags via i18n lookup without modifying the core English schema keys.</w:t>
+      </w:r>
+    </w:p>
+    <w:p>
+      <w:pPr>
+        <w:pStyle w:val="Heading1"/>
+        <w:spacing w:after="150" w:before="300"/>
+      </w:pPr>
+      <w:r>
+        <w:t xml:space="preserve">5. Authentication Pages Theme Toggle (Sun &amp; Moon Mode)</w:t>
+      </w:r>
+    </w:p>
+    <w:p>
+      <w:pPr>
+        <w:spacing w:after="200"/>
+      </w:pPr>
+      <w:r>
+        <w:t xml:space="preserve">A high-contrast, responsive theme toggle button featuring animated Sun (light) and Moon (dark) icons has been implemented across all authentication pages (Sign In / Login, Sign Up / Registration, and Password Reset). Positioned in a top-right floating pill, it enables immediate mode switching with persistent user preference storage in localStorage and system theme synchronization.</w:t>
       </w:r>
     </w:p>
     <w:sectPr>

</xml_diff>